<commit_message>
Prioritize direct method, add second tested collection version, split license from vaulted credentials
- Document collection 33.0.48+git940b822 as tested; playbook 40 now
  accepts a list of tested versions
- Note RHEL 9.8 may work but is not officially supported
- Reorder deployment methods: direct (fully tested, recommended) before
  controller-based (not yet 100% tested end-to-end)
- Split group_vars: cluster-license.yml (product key + license identity,
  plaintext by design) from cluster-credentials.yml (passwords, vaulted)
- Correct CMsh script invocation to 'cmsh -f <script> -q -x' in all docs
- vault-pass-prompt.sh: verify /dev/tty is openable, not just present
- Add troubleshooting entry for editing the vaulted credentials file
- Regenerate deployment guide Word document

Co-Authored-By: Claude Fable 5 <noreply@anthropic.com>
</commit_message>
<xml_diff>
--- a/docs/bcm-deployment-guide.docx
+++ b/docs/bcm-deployment-guide.docx
@@ -174,7 +174,7 @@
     <w:tbl>
       <w:tblPr>
         <w:tblStyle w:val="Table"/>
-        <w:tblW w:type="auto" w:w="0"/>
+        <w:tblW w:type="pct" w:w="5000"/>
         <w:tblLook w:firstRow="1" w:lastRow="0" w:firstColumn="0" w:lastColumn="0" w:noHBand="0" w:noVBand="0" w:val="0020"/>
       </w:tblPr>
       <w:tblGrid>
@@ -309,7 +309,7 @@
               <w:jc w:val="left"/>
             </w:pPr>
             <w:r>
-              <w:t xml:space="preserve">brightcomputing.installer110 31.1.452+git66ec186</w:t>
+              <w:t xml:space="preserve">brightcomputing.installer110 31.1.452+git66ec186 and 33.0.48+git940b822</w:t>
             </w:r>
           </w:p>
         </w:tc>
@@ -436,7 +436,7 @@
               <w:jc w:val="left"/>
             </w:pPr>
             <w:r>
-              <w:t xml:space="preserve">Added RHEL release-lock requirement and enforcement, Ansible Vault password prompting, cm.repo handling</w:t>
+              <w:t xml:space="preserve">Added RHEL release-lock requirement and enforcement, Ansible Vault password prompting, cm.repo handling. Second tested collection version (33.0.48+git940b822). Direct method prioritized over controller-based.</w:t>
             </w:r>
           </w:p>
         </w:tc>
@@ -566,6 +566,24 @@
       </w:r>
       <w:r>
         <w:t xml:space="preserve">before deployment begins — see Section 3.3.</w:t>
+      </w:r>
+    </w:p>
+    <w:p>
+      <w:pPr>
+        <w:pStyle w:val="BodyText"/>
+      </w:pPr>
+      <w:r>
+        <w:rPr>
+          <w:bCs/>
+          <w:b/>
+        </w:rPr>
+        <w:t xml:space="preserve">About RHEL 9.8:</w:t>
+      </w:r>
+      <w:r>
+        <w:t xml:space="preserve"> </w:t>
+      </w:r>
+      <w:r>
+        <w:t xml:space="preserve">While RHEL 9.8 may work in practice, it is not officially supported as of 18 July 2026. The release-lock checks in playbooks 10 and 30 accept only 9.6 and 9.7. Do not deploy on 9.8 for production use until it is officially supported and tested.</w:t>
       </w:r>
     </w:p>
     <w:bookmarkEnd w:id="22"/>
@@ -893,13 +911,13 @@
         <w:t xml:space="preserve">The automation supports two approaches. Both use the same playbooks; they differ only in where Ansible runs and which inventory is used.</w:t>
       </w:r>
     </w:p>
-    <w:bookmarkStart w:id="25" w:name="controller-based-method-recommended"/>
+    <w:bookmarkStart w:id="25" w:name="direct-method-recommended"/>
     <w:p>
       <w:pPr>
         <w:pStyle w:val="Heading2"/>
       </w:pPr>
       <w:r>
-        <w:t xml:space="preserve">2.1 Controller-Based Method (Recommended)</w:t>
+        <w:t xml:space="preserve">2.1 Direct Method (Recommended)</w:t>
       </w:r>
     </w:p>
     <w:p>
@@ -907,7 +925,17 @@
         <w:pStyle w:val="FirstParagraph"/>
       </w:pPr>
       <w:r>
-        <w:t xml:space="preserve">Ansible runs on a separate control node (Rocky Linux 9.x or RHEL 9.x) and deploys to remote head nodes over SSH. This allows managing multiple deployments from one location.</w:t>
+        <w:t xml:space="preserve">Ansible runs directly on the target head node itself. Suitable for single-node or offline deployments.</w:t>
+      </w:r>
+      <w:r>
+        <w:t xml:space="preserve"> </w:t>
+      </w:r>
+      <w:r>
+        <w:rPr>
+          <w:bCs/>
+          <w:b/>
+        </w:rPr>
+        <w:t xml:space="preserve">This is the fully tested and recommended deployment path.</w:t>
       </w:r>
     </w:p>
     <w:p>
@@ -928,7 +956,7 @@
         <w:rPr>
           <w:rStyle w:val="VerbatimChar"/>
         </w:rPr>
-        <w:t xml:space="preserve">playbooks/inventory/hosts</w:t>
+        <w:t xml:space="preserve">playbooks/inventory/localhost</w:t>
       </w:r>
     </w:p>
     <w:p>
@@ -949,35 +977,23 @@
         <w:rPr>
           <w:rStyle w:val="VerbatimChar"/>
         </w:rPr>
-        <w:t xml:space="preserve">--hosts</w:t>
-      </w:r>
-      <w:r>
-        <w:t xml:space="preserve"> </w:t>
-      </w:r>
-      <w:r>
-        <w:t xml:space="preserve">(or</w:t>
-      </w:r>
-      <w:r>
-        <w:t xml:space="preserve"> </w:t>
-      </w:r>
-      <w:r>
-        <w:rPr>
-          <w:rStyle w:val="VerbatimChar"/>
-        </w:rPr>
-        <w:t xml:space="preserve">--remote</w:t>
-      </w:r>
-      <w:r>
-        <w:t xml:space="preserve">)</w:t>
+        <w:t xml:space="preserve">--local</w:t>
+      </w:r>
+      <w:r>
+        <w:t xml:space="preserve"> </w:t>
+      </w:r>
+      <w:r>
+        <w:t xml:space="preserve">(the default for most wrappers)</w:t>
       </w:r>
     </w:p>
     <w:bookmarkEnd w:id="25"/>
-    <w:bookmarkStart w:id="26" w:name="direct-method"/>
+    <w:bookmarkStart w:id="26" w:name="X43728e64155dd09b04a44c5b5dac2da427e0700"/>
     <w:p>
       <w:pPr>
         <w:pStyle w:val="Heading2"/>
       </w:pPr>
       <w:r>
-        <w:t xml:space="preserve">2.2 Direct Method</w:t>
+        <w:t xml:space="preserve">2.2 Controller-Based Method (Not Yet Fully Tested)</w:t>
       </w:r>
     </w:p>
     <w:p>
@@ -985,7 +1001,25 @@
         <w:pStyle w:val="FirstParagraph"/>
       </w:pPr>
       <w:r>
-        <w:t xml:space="preserve">Ansible runs directly on the target head node itself. Suitable for single-node or offline deployments.</w:t>
+        <w:t xml:space="preserve">Ansible runs on a separate control node (Rocky Linux 9.x or RHEL 9.x) and deploys to remote head nodes over SSH. This allows managing multiple deployments from one location.</w:t>
+      </w:r>
+    </w:p>
+    <w:p>
+      <w:pPr>
+        <w:pStyle w:val="BodyText"/>
+      </w:pPr>
+      <w:r>
+        <w:rPr>
+          <w:bCs/>
+          <w:b/>
+        </w:rPr>
+        <w:t xml:space="preserve">NOTE:</w:t>
+      </w:r>
+      <w:r>
+        <w:t xml:space="preserve"> </w:t>
+      </w:r>
+      <w:r>
+        <w:t xml:space="preserve">The controller-based method has not been 100% tested end-to-end. Prefer the direct method until controller-based testing is complete.</w:t>
       </w:r>
     </w:p>
     <w:p>
@@ -1006,7 +1040,7 @@
         <w:rPr>
           <w:rStyle w:val="VerbatimChar"/>
         </w:rPr>
-        <w:t xml:space="preserve">playbooks/inventory/localhost</w:t>
+        <w:t xml:space="preserve">playbooks/inventory/hosts</w:t>
       </w:r>
     </w:p>
     <w:p>
@@ -1027,13 +1061,25 @@
         <w:rPr>
           <w:rStyle w:val="VerbatimChar"/>
         </w:rPr>
-        <w:t xml:space="preserve">--local</w:t>
-      </w:r>
-      <w:r>
-        <w:t xml:space="preserve"> </w:t>
-      </w:r>
-      <w:r>
-        <w:t xml:space="preserve">(the default for most wrappers)</w:t>
+        <w:t xml:space="preserve">--hosts</w:t>
+      </w:r>
+      <w:r>
+        <w:t xml:space="preserve"> </w:t>
+      </w:r>
+      <w:r>
+        <w:t xml:space="preserve">(or</w:t>
+      </w:r>
+      <w:r>
+        <w:t xml:space="preserve"> </w:t>
+      </w:r>
+      <w:r>
+        <w:rPr>
+          <w:rStyle w:val="VerbatimChar"/>
+        </w:rPr>
+        <w:t xml:space="preserve">--remote</w:t>
+      </w:r>
+      <w:r>
+        <w:t xml:space="preserve">)</w:t>
       </w:r>
     </w:p>
     <w:p>
@@ -1518,7 +1564,7 @@
               <w:jc w:val="left"/>
             </w:pPr>
             <w:r>
-              <w:t xml:space="preserve">31.1.452+git66ec186 (tested)</w:t>
+              <w:t xml:space="preserve">31.1.452+git66ec186 and 33.0.48+git940b822 (tested)</w:t>
             </w:r>
           </w:p>
         </w:tc>
@@ -1636,14 +1682,6 @@
       </w:pPr>
       <w:r>
         <w:t xml:space="preserve">4.1 Sensitive Files</w:t>
-      </w:r>
-    </w:p>
-    <w:p>
-      <w:pPr>
-        <w:pStyle w:val="FirstParagraph"/>
-      </w:pPr>
-      <w:r>
-        <w:t xml:space="preserve">Two files contain credentials and must never be committed to version control in plaintext:</w:t>
       </w:r>
     </w:p>
     <w:tbl>
@@ -1722,7 +1760,7 @@
               <w:jc w:val="left"/>
             </w:pPr>
             <w:r>
-              <w:t xml:space="preserve">BCM product key, license identity, service passwords</w:t>
+              <w:t xml:space="preserve">BCM service passwords only</w:t>
             </w:r>
           </w:p>
         </w:tc>
@@ -1735,6 +1773,47 @@
             </w:pPr>
             <w:r>
               <w:t xml:space="preserve">Encrypt with Ansible Vault (Section 4.2)</w:t>
+            </w:r>
+          </w:p>
+        </w:tc>
+      </w:tr>
+      <w:tr>
+        <w:tc>
+          <w:tcPr/>
+          <w:p>
+            <w:pPr>
+              <w:pStyle w:val="Compact"/>
+              <w:jc w:val="left"/>
+            </w:pPr>
+            <w:r>
+              <w:rPr>
+                <w:rStyle w:val="VerbatimChar"/>
+              </w:rPr>
+              <w:t xml:space="preserve">playbooks/group_vars/head_node/cluster-license.yml</w:t>
+            </w:r>
+          </w:p>
+        </w:tc>
+        <w:tc>
+          <w:tcPr/>
+          <w:p>
+            <w:pPr>
+              <w:pStyle w:val="Compact"/>
+              <w:jc w:val="left"/>
+            </w:pPr>
+            <w:r>
+              <w:t xml:space="preserve">BCM product key and license identity</w:t>
+            </w:r>
+          </w:p>
+        </w:tc>
+        <w:tc>
+          <w:tcPr/>
+          <w:p>
+            <w:pPr>
+              <w:pStyle w:val="Compact"/>
+              <w:jc w:val="left"/>
+            </w:pPr>
+            <w:r>
+              <w:t xml:space="preserve">Plaintext by design — kept readable and diffable. Not vaulted.</w:t>
             </w:r>
           </w:p>
         </w:tc>
@@ -2047,13 +2126,30 @@
       </w:r>
     </w:p>
     <w:bookmarkEnd w:id="35"/>
-    <w:bookmarkStart w:id="36" w:name="credential-fields-reference"/>
+    <w:bookmarkStart w:id="36" w:name="license-and-credential-fields-reference"/>
     <w:p>
       <w:pPr>
         <w:pStyle w:val="Heading2"/>
       </w:pPr>
       <w:r>
-        <w:t xml:space="preserve">4.4 Credential Fields Reference</w:t>
+        <w:t xml:space="preserve">4.4 License and Credential Fields Reference</w:t>
+      </w:r>
+    </w:p>
+    <w:p>
+      <w:pPr>
+        <w:pStyle w:val="FirstParagraph"/>
+      </w:pPr>
+      <w:r>
+        <w:t xml:space="preserve">License fields (</w:t>
+      </w:r>
+      <w:r>
+        <w:rPr>
+          <w:rStyle w:val="VerbatimChar"/>
+        </w:rPr>
+        <w:t xml:space="preserve">cluster-license.yml</w:t>
+      </w:r>
+      <w:r>
+        <w:t xml:space="preserve">, plaintext):</w:t>
       </w:r>
     </w:p>
     <w:tbl>
@@ -2164,6 +2260,63 @@
             </w:r>
             <w:r>
               <w:t xml:space="preserve">field is auto-populated from the head node’s default interface — do not set manually.</w:t>
+            </w:r>
+          </w:p>
+        </w:tc>
+      </w:tr>
+    </w:tbl>
+    <w:p>
+      <w:pPr>
+        <w:pStyle w:val="BodyText"/>
+      </w:pPr>
+      <w:r>
+        <w:t xml:space="preserve">Password fields (</w:t>
+      </w:r>
+      <w:r>
+        <w:rPr>
+          <w:rStyle w:val="VerbatimChar"/>
+        </w:rPr>
+        <w:t xml:space="preserve">cluster-credentials.yml</w:t>
+      </w:r>
+      <w:r>
+        <w:t xml:space="preserve">, vaulted):</w:t>
+      </w:r>
+    </w:p>
+    <w:tbl>
+      <w:tblPr>
+        <w:tblStyle w:val="Table"/>
+        <w:tblW w:type="pct" w:w="5000"/>
+        <w:tblLook w:firstRow="1" w:lastRow="0" w:firstColumn="0" w:lastColumn="0" w:noHBand="0" w:noVBand="0" w:val="0020"/>
+      </w:tblPr>
+      <w:tblGrid>
+        <w:gridCol w:w="3960"/>
+        <w:gridCol w:w="3960"/>
+      </w:tblGrid>
+      <w:tr>
+        <w:trPr>
+          <w:tblHeader w:val="true"/>
+        </w:trPr>
+        <w:tc>
+          <w:tcPr/>
+          <w:p>
+            <w:pPr>
+              <w:pStyle w:val="Compact"/>
+              <w:jc w:val="left"/>
+            </w:pPr>
+            <w:r>
+              <w:t xml:space="preserve">Field</w:t>
+            </w:r>
+          </w:p>
+        </w:tc>
+        <w:tc>
+          <w:tcPr/>
+          <w:p>
+            <w:pPr>
+              <w:pStyle w:val="Compact"/>
+              <w:jc w:val="left"/>
+            </w:pPr>
+            <w:r>
+              <w:t xml:space="preserve">Description</w:t>
             </w:r>
           </w:p>
         </w:tc>
@@ -4246,7 +4399,7 @@
         <w:rPr>
           <w:rStyle w:val="AttributeTok"/>
         </w:rPr>
-        <w:t xml:space="preserve">--hosts</w:t>
+        <w:t xml:space="preserve">--local</w:t>
       </w:r>
       <w:r>
         <w:rPr>
@@ -4258,7 +4411,7 @@
         <w:rPr>
           <w:rStyle w:val="CommentTok"/>
         </w:rPr>
-        <w:t xml:space="preserve"># or --local for the direct method</w:t>
+        <w:t xml:space="preserve"># or --hosts for the controller method</w:t>
       </w:r>
     </w:p>
     <w:p>
@@ -4381,7 +4534,19 @@
         <w:rPr>
           <w:rStyle w:val="AttributeTok"/>
         </w:rPr>
-        <w:t xml:space="preserve">--hosts</w:t>
+        <w:t xml:space="preserve">--local</w:t>
+      </w:r>
+      <w:r>
+        <w:rPr>
+          <w:rStyle w:val="NormalTok"/>
+        </w:rPr>
+        <w:t xml:space="preserve">   </w:t>
+      </w:r>
+      <w:r>
+        <w:rPr>
+          <w:rStyle w:val="CommentTok"/>
+        </w:rPr>
+        <w:t xml:space="preserve"># or --hosts for the controller method</w:t>
       </w:r>
     </w:p>
     <w:p>
@@ -4477,7 +4642,19 @@
         <w:rPr>
           <w:rStyle w:val="AttributeTok"/>
         </w:rPr>
-        <w:t xml:space="preserve">--hosts</w:t>
+        <w:t xml:space="preserve">--local</w:t>
+      </w:r>
+      <w:r>
+        <w:rPr>
+          <w:rStyle w:val="NormalTok"/>
+        </w:rPr>
+        <w:t xml:space="preserve">   </w:t>
+      </w:r>
+      <w:r>
+        <w:rPr>
+          <w:rStyle w:val="CommentTok"/>
+        </w:rPr>
+        <w:t xml:space="preserve"># or --hosts for the controller method</w:t>
       </w:r>
     </w:p>
     <w:p>
@@ -4713,7 +4890,7 @@
         <w:pStyle w:val="FirstParagraph"/>
       </w:pPr>
       <w:r>
-        <w:t xml:space="preserve">The patch is idempotent. It is verified against collection version 31.1.452+git66ec186 only; the playbook warns if a different version is installed. To revert, force-reinstall the collection:</w:t>
+        <w:t xml:space="preserve">The patch is idempotent. It is verified against collection versions 31.1.452+git66ec186 and 33.0.48+git940b822 only; the playbook warns if a different version is installed. To revert, force-reinstall the collection:</w:t>
       </w:r>
     </w:p>
     <w:p>
@@ -5017,6 +5194,21 @@
       </w:pPr>
       <w:r>
         <w:rPr>
+          <w:rStyle w:val="BuiltInTok"/>
+        </w:rPr>
+        <w:t xml:space="preserve">cd</w:t>
+      </w:r>
+      <w:r>
+        <w:rPr>
+          <w:rStyle w:val="NormalTok"/>
+        </w:rPr>
+        <w:t xml:space="preserve"> playbooks/post-deploy</w:t>
+      </w:r>
+      <w:r>
+        <w:br/>
+      </w:r>
+      <w:r>
+        <w:rPr>
           <w:rStyle w:val="ExtensionTok"/>
         </w:rPr>
         <w:t xml:space="preserve">cmsh</w:t>
@@ -5029,15 +5221,33 @@
       </w:r>
       <w:r>
         <w:rPr>
-          <w:rStyle w:val="OperatorTok"/>
-        </w:rPr>
-        <w:t xml:space="preserve">&lt;</w:t>
+          <w:rStyle w:val="AttributeTok"/>
+        </w:rPr>
+        <w:t xml:space="preserve">-f</w:t>
       </w:r>
       <w:r>
         <w:rPr>
           <w:rStyle w:val="NormalTok"/>
         </w:rPr>
-        <w:t xml:space="preserve"> playbooks/post-deploy/bcm-cmsh-scripts/rhel97-updatemodules.txt</w:t>
+        <w:t xml:space="preserve"> bcm-cmsh-scripts/rhel97-updatemodules.txt </w:t>
+      </w:r>
+      <w:r>
+        <w:rPr>
+          <w:rStyle w:val="AttributeTok"/>
+        </w:rPr>
+        <w:t xml:space="preserve">-q</w:t>
+      </w:r>
+      <w:r>
+        <w:rPr>
+          <w:rStyle w:val="NormalTok"/>
+        </w:rPr>
+        <w:t xml:space="preserve"> </w:t>
+      </w:r>
+      <w:r>
+        <w:rPr>
+          <w:rStyle w:val="AttributeTok"/>
+        </w:rPr>
+        <w:t xml:space="preserve">-x</w:t>
       </w:r>
       <w:r>
         <w:br/>
@@ -5056,15 +5266,33 @@
       </w:r>
       <w:r>
         <w:rPr>
-          <w:rStyle w:val="OperatorTok"/>
-        </w:rPr>
-        <w:t xml:space="preserve">&lt;</w:t>
+          <w:rStyle w:val="AttributeTok"/>
+        </w:rPr>
+        <w:t xml:space="preserve">-f</w:t>
       </w:r>
       <w:r>
         <w:rPr>
           <w:rStyle w:val="NormalTok"/>
         </w:rPr>
-        <w:t xml:space="preserve"> playbooks/post-deploy/bcm-cmsh-scripts/rhel97-modulecleanup.txt</w:t>
+        <w:t xml:space="preserve"> bcm-cmsh-scripts/rhel97-modulecleanup.txt </w:t>
+      </w:r>
+      <w:r>
+        <w:rPr>
+          <w:rStyle w:val="AttributeTok"/>
+        </w:rPr>
+        <w:t xml:space="preserve">-q</w:t>
+      </w:r>
+      <w:r>
+        <w:rPr>
+          <w:rStyle w:val="NormalTok"/>
+        </w:rPr>
+        <w:t xml:space="preserve"> </w:t>
+      </w:r>
+      <w:r>
+        <w:rPr>
+          <w:rStyle w:val="AttributeTok"/>
+        </w:rPr>
+        <w:t xml:space="preserve">-x</w:t>
       </w:r>
       <w:r>
         <w:br/>
@@ -5083,15 +5311,33 @@
       </w:r>
       <w:r>
         <w:rPr>
-          <w:rStyle w:val="OperatorTok"/>
-        </w:rPr>
-        <w:t xml:space="preserve">&lt;</w:t>
+          <w:rStyle w:val="AttributeTok"/>
+        </w:rPr>
+        <w:t xml:space="preserve">-f</w:t>
       </w:r>
       <w:r>
         <w:rPr>
           <w:rStyle w:val="NormalTok"/>
         </w:rPr>
-        <w:t xml:space="preserve"> playbooks/post-deploy/bcm-cmsh-scripts/rhel97-startup.txt</w:t>
+        <w:t xml:space="preserve"> bcm-cmsh-scripts/rhel97-startup.txt </w:t>
+      </w:r>
+      <w:r>
+        <w:rPr>
+          <w:rStyle w:val="AttributeTok"/>
+        </w:rPr>
+        <w:t xml:space="preserve">-q</w:t>
+      </w:r>
+      <w:r>
+        <w:rPr>
+          <w:rStyle w:val="NormalTok"/>
+        </w:rPr>
+        <w:t xml:space="preserve"> </w:t>
+      </w:r>
+      <w:r>
+        <w:rPr>
+          <w:rStyle w:val="AttributeTok"/>
+        </w:rPr>
+        <w:t xml:space="preserve">-x</w:t>
       </w:r>
     </w:p>
     <w:p>
@@ -5525,6 +5771,89 @@
               <w:jc w:val="left"/>
             </w:pPr>
             <w:r>
+              <w:t xml:space="preserve">Need to edit or view the encrypted credentials file</w:t>
+            </w:r>
+          </w:p>
+        </w:tc>
+        <w:tc>
+          <w:tcPr/>
+          <w:p>
+            <w:pPr>
+              <w:pStyle w:val="Compact"/>
+              <w:jc w:val="left"/>
+            </w:pPr>
+            <w:r>
+              <w:t xml:space="preserve">From the</w:t>
+            </w:r>
+            <w:r>
+              <w:t xml:space="preserve"> </w:t>
+            </w:r>
+            <w:r>
+              <w:rPr>
+                <w:rStyle w:val="VerbatimChar"/>
+              </w:rPr>
+              <w:t xml:space="preserve">playbooks/</w:t>
+            </w:r>
+            <w:r>
+              <w:t xml:space="preserve"> </w:t>
+            </w:r>
+            <w:r>
+              <w:t xml:space="preserve">directory:</w:t>
+            </w:r>
+            <w:r>
+              <w:t xml:space="preserve"> </w:t>
+            </w:r>
+            <w:r>
+              <w:rPr>
+                <w:rStyle w:val="VerbatimChar"/>
+              </w:rPr>
+              <w:t xml:space="preserve">ansible-vault edit group_vars/head_node/cluster-credentials.yml</w:t>
+            </w:r>
+            <w:r>
+              <w:t xml:space="preserve"> </w:t>
+            </w:r>
+            <w:r>
+              <w:t xml:space="preserve">(decrypts to a temp file, opens</w:t>
+            </w:r>
+            <w:r>
+              <w:t xml:space="preserve"> </w:t>
+            </w:r>
+            <w:r>
+              <w:rPr>
+                <w:rStyle w:val="VerbatimChar"/>
+              </w:rPr>
+              <w:t xml:space="preserve">$EDITOR</w:t>
+            </w:r>
+            <w:r>
+              <w:t xml:space="preserve">, re-encrypts on save). Use</w:t>
+            </w:r>
+            <w:r>
+              <w:t xml:space="preserve"> </w:t>
+            </w:r>
+            <w:r>
+              <w:rPr>
+                <w:rStyle w:val="VerbatimChar"/>
+              </w:rPr>
+              <w:t xml:space="preserve">ansible-vault view</w:t>
+            </w:r>
+            <w:r>
+              <w:t xml:space="preserve"> </w:t>
+            </w:r>
+            <w:r>
+              <w:t xml:space="preserve">to read without editing. The vault password is prompted for automatically.</w:t>
+            </w:r>
+          </w:p>
+        </w:tc>
+      </w:tr>
+      <w:tr>
+        <w:tc>
+          <w:tcPr/>
+          <w:p>
+            <w:pPr>
+              <w:pStyle w:val="Compact"/>
+              <w:jc w:val="left"/>
+            </w:pPr>
+            <w:r>
               <w:t xml:space="preserve">“</w:t>
             </w:r>
             <w:r>
@@ -5909,7 +6238,7 @@
         <w:rPr>
           <w:rStyle w:val="VerbatimChar"/>
         </w:rPr>
-        <w:t xml:space="preserve">    group_vars/head_node/            Cluster settings, install method, credentials</w:t>
+        <w:t xml:space="preserve">    group_vars/head_node/            Cluster settings, install method, license (plaintext), credentials (vaulted)</w:t>
       </w:r>
       <w:r>
         <w:br/>

</xml_diff>